<commit_message>
Drop laboratory and optional attributes at supervisory review
Retrain on the 13-attribute point-of-care feature space, recode
Neurological Symptoms as a binary Headache indicator, move the referral
threshold to 0.03, and add 36 integration tests asserting the dataset,
the artefacts, the form and the prediction service stay in agreement.

Co-Authored-By: Claude Opus 5 <noreply@anthropic.com>
Claude-Session: https://claude.ai/code/session_01Ti7poxGYDgUdpwYDYABpUk
</commit_message>
<xml_diff>
--- a/thesis/CHAPTER_FIVE.docx
+++ b/thesis/CHAPTER_FIVE.docx
@@ -151,7 +151,7 @@
           <w:sz w:val="24"/>
           <w:szCs w:val="24"/>
         </w:rPr>
-        <w:t xml:space="preserve">A signal audit was then conducted, comparing the optimised model against three reference classifiers, measuring the statistical association between every attribute and the diagnosis, and performing an ablation study. Two further public typhoid datasets were obtained and subjected to the identical audit. Finally, the optimised model was deployed as a live, authenticated, role-based clinical decision-support application, verified by 168 automated tests and by a ten-case user acceptance test conducted against the deployed instance.</w:t>
+        <w:t xml:space="preserve">A signal audit was then conducted, comparing the optimised model against three reference classifiers, measuring the statistical association between every attribute and the diagnosis, and performing an ablation study. Two further public typhoid datasets were obtained and subjected to the identical audit. Finally, the optimised model was deployed as a live, authenticated, role-based clinical decision-support application, verified by 204 automated tests and by a ten-case user acceptance test conducted against the deployed instance.</w:t>
       </w:r>
     </w:p>
     <w:p>
@@ -371,7 +371,7 @@
           <w:sz w:val="24"/>
           <w:szCs w:val="24"/>
         </w:rPr>
-        <w:t xml:space="preserve"> The deployed system provides role-based access for clinicians, administrators and auditors, a schema-driven assessment form, calibrated probability estimates, triage recommendations, per-prediction explanations, an append-only audit trail and a programmatic interface. It operates within 0.1 CPU and 512 MB of memory. All 168 automated tests pass, and the deployed instance reproduced the expected output in all ten user acceptance test cases.</w:t>
+        <w:t xml:space="preserve"> The deployed system provides role-based access for clinicians, administrators and auditors, a schema-driven assessment form, calibrated probability estimates, triage recommendations, per-prediction explanations, an append-only audit trail and a programmatic interface. It operates within 0.1 CPU and 512 MB of memory. All 204 automated tests pass, and the deployed instance reproduced the expected output in all ten user acceptance test cases.</w:t>
       </w:r>
     </w:p>
     <w:p>
@@ -1136,7 +1136,7 @@
           <w:sz w:val="24"/>
           <w:szCs w:val="24"/>
         </w:rPr>
-        <w:t xml:space="preserve"> The system is live, authenticated, role-based, responsive to mobile devices, covered by 168 automated tests, and architected so that the machine learning package and the web application are independently replaceable. It provides a working deployment pathway for any subsequent researcher who obtains a clinically valid typhoid dataset.</w:t>
+        <w:t xml:space="preserve"> The system is live, authenticated, role-based, responsive to mobile devices, covered by 204 automated tests, and architected so that the machine learning package and the web application are independently replaceable. It provides a working deployment pathway for any subsequent researcher who obtains a clinically valid typhoid dataset.</w:t>
       </w:r>
     </w:p>
     <w:p>

</xml_diff>